<commit_message>
lab9 good graphic with separation
</commit_message>
<xml_diff>
--- a/отчет lab9.docx
+++ b/отчет lab9.docx
@@ -424,6 +424,8 @@
         </w:rPr>
         <w:t>г.</w:t>
       </w:r>
+      <w:bookmarkStart w:id="0" w:name="_GoBack"/>
+      <w:bookmarkEnd w:id="0"/>
     </w:p>
     <w:p>
       <w:pPr>
@@ -562,18 +564,7 @@
           <w:shd w:val="clear" w:color="auto" w:fill="FFFFFF"/>
           <w:lang w:val="ru-RU"/>
         </w:rPr>
-        <w:t xml:space="preserve">В ходе лабораторной работы был разработан </w:t>
-      </w:r>
-      <w:r>
-        <w:rPr>
-          <w:rFonts w:ascii="Times New Roman" w:eastAsia="Segoe UI" w:hAnsi="Times New Roman"/>
-          <w:color w:val="0F1115"/>
-          <w:sz w:val="32"/>
-          <w:szCs w:val="32"/>
-          <w:shd w:val="clear" w:color="auto" w:fill="FFFFFF"/>
-          <w:lang w:val="ru-RU"/>
-        </w:rPr>
-        <w:t>алгоритм, который создаёт в памяти специальную структуру данных - множество фрагментов (связных списков), - и измеряет среднее время доступа к их элементам.</w:t>
+        <w:t>В ходе лабораторной работы был разработан алгоритм, который создаёт в памяти специальную структуру данных - множество фрагментов (связных списков), - и измеряет среднее время доступа к их элементам.</w:t>
       </w:r>
     </w:p>
     <w:p>
@@ -601,18 +592,7 @@
           <w:shd w:val="clear" w:color="auto" w:fill="FFFFFF"/>
           <w:lang w:val="ru-RU"/>
         </w:rPr>
-        <w:t xml:space="preserve">Для обеспечения того, чтобы все фрагменты конкурировали за один и тот же набор </w:t>
-      </w:r>
-      <w:r>
-        <w:rPr>
-          <w:rFonts w:ascii="Times New Roman" w:eastAsia="Segoe UI" w:hAnsi="Times New Roman"/>
-          <w:color w:val="0F1115"/>
-          <w:sz w:val="32"/>
-          <w:szCs w:val="32"/>
-          <w:shd w:val="clear" w:color="auto" w:fill="FFFFFF"/>
-          <w:lang w:val="ru-RU"/>
-        </w:rPr>
-        <w:t>кэш-памяти, было выбрано смещение 16 МБ между началами фрагментов.</w:t>
+        <w:t>Полный компилируемый листинг программы и команда компиляции представлены в приложении.</w:t>
       </w:r>
     </w:p>
     <w:p>
@@ -631,7 +611,14 @@
           <w:lang w:val="ru-RU"/>
         </w:rPr>
       </w:pPr>
-      <w:r>
+    </w:p>
+    <w:p>
+      <w:pPr>
+        <w:pStyle w:val="a5"/>
+        <w:shd w:val="clear" w:color="auto" w:fill="FFFFFF"/>
+        <w:spacing w:before="192" w:after="192" w:line="360" w:lineRule="auto"/>
+        <w:ind w:firstLineChars="137" w:firstLine="438"/>
+        <w:jc w:val="both"/>
         <w:rPr>
           <w:rFonts w:ascii="Times New Roman" w:eastAsia="Segoe UI" w:hAnsi="Times New Roman"/>
           <w:color w:val="0F1115"/>
@@ -640,7 +627,17 @@
           <w:shd w:val="clear" w:color="auto" w:fill="FFFFFF"/>
           <w:lang w:val="ru-RU"/>
         </w:rPr>
-        <w:t>Полный компилируемый листинг программы и команд</w:t>
+      </w:pPr>
+      <w:r>
+        <w:rPr>
+          <w:rFonts w:ascii="Times New Roman" w:eastAsia="Segoe UI" w:hAnsi="Times New Roman"/>
+          <w:color w:val="0F1115"/>
+          <w:sz w:val="32"/>
+          <w:szCs w:val="32"/>
+          <w:shd w:val="clear" w:color="auto" w:fill="FFFFFF"/>
+          <w:lang w:val="ru-RU"/>
+        </w:rPr>
+        <w:t>После нескольких попыток подбора размера массива был</w:t>
       </w:r>
       <w:r>
         <w:rPr>
@@ -651,7 +648,7 @@
           <w:shd w:val="clear" w:color="auto" w:fill="FFFFFF"/>
           <w:lang w:val="ru-RU"/>
         </w:rPr>
-        <w:t>а</w:t>
+        <w:t>и</w:t>
       </w:r>
       <w:r>
         <w:rPr>
@@ -662,7 +659,174 @@
           <w:shd w:val="clear" w:color="auto" w:fill="FFFFFF"/>
           <w:lang w:val="ru-RU"/>
         </w:rPr>
-        <w:t xml:space="preserve"> компиляции представлены в приложении.</w:t>
+        <w:t xml:space="preserve"> выбран</w:t>
+      </w:r>
+      <w:r>
+        <w:rPr>
+          <w:rFonts w:ascii="Times New Roman" w:eastAsia="Segoe UI" w:hAnsi="Times New Roman"/>
+          <w:color w:val="0F1115"/>
+          <w:sz w:val="32"/>
+          <w:szCs w:val="32"/>
+          <w:shd w:val="clear" w:color="auto" w:fill="FFFFFF"/>
+          <w:lang w:val="ru-RU"/>
+        </w:rPr>
+        <w:t>ы</w:t>
+      </w:r>
+      <w:r>
+        <w:rPr>
+          <w:rFonts w:ascii="Times New Roman" w:eastAsia="Segoe UI" w:hAnsi="Times New Roman"/>
+          <w:color w:val="0F1115"/>
+          <w:sz w:val="32"/>
+          <w:szCs w:val="32"/>
+          <w:shd w:val="clear" w:color="auto" w:fill="FFFFFF"/>
+          <w:lang w:val="ru-RU"/>
+        </w:rPr>
+        <w:t xml:space="preserve"> значени</w:t>
+      </w:r>
+      <w:r>
+        <w:rPr>
+          <w:rFonts w:ascii="Times New Roman" w:eastAsia="Segoe UI" w:hAnsi="Times New Roman"/>
+          <w:color w:val="0F1115"/>
+          <w:sz w:val="32"/>
+          <w:szCs w:val="32"/>
+          <w:shd w:val="clear" w:color="auto" w:fill="FFFFFF"/>
+          <w:lang w:val="ru-RU"/>
+        </w:rPr>
+        <w:t>я</w:t>
+      </w:r>
+      <w:r>
+        <w:rPr>
+          <w:rFonts w:ascii="Times New Roman" w:eastAsia="Segoe UI" w:hAnsi="Times New Roman"/>
+          <w:color w:val="0F1115"/>
+          <w:sz w:val="32"/>
+          <w:szCs w:val="32"/>
+          <w:shd w:val="clear" w:color="auto" w:fill="FFFFFF"/>
+          <w:lang w:val="ru-RU"/>
+        </w:rPr>
+        <w:t xml:space="preserve"> </w:t>
+      </w:r>
+      <w:bookmarkStart w:id="1" w:name="_Hlk216396232"/>
+      <w:r>
+        <w:rPr>
+          <w:rFonts w:ascii="Times New Roman" w:eastAsia="Segoe UI" w:hAnsi="Times New Roman"/>
+          <w:color w:val="0F1115"/>
+          <w:sz w:val="32"/>
+          <w:szCs w:val="32"/>
+          <w:shd w:val="clear" w:color="auto" w:fill="FFFFFF"/>
+          <w:lang w:val="ru-RU"/>
+        </w:rPr>
+        <w:t xml:space="preserve">для </w:t>
+      </w:r>
+      <w:r>
+        <w:rPr>
+          <w:rFonts w:ascii="Times New Roman" w:eastAsia="Segoe UI" w:hAnsi="Times New Roman"/>
+          <w:color w:val="0F1115"/>
+          <w:sz w:val="32"/>
+          <w:szCs w:val="32"/>
+          <w:shd w:val="clear" w:color="auto" w:fill="FFFFFF"/>
+          <w:lang w:val="en-US"/>
+        </w:rPr>
+        <w:t>OFFSET</w:t>
+      </w:r>
+      <w:r>
+        <w:rPr>
+          <w:rFonts w:ascii="Times New Roman" w:eastAsia="Segoe UI" w:hAnsi="Times New Roman"/>
+          <w:color w:val="0F1115"/>
+          <w:sz w:val="32"/>
+          <w:szCs w:val="32"/>
+          <w:shd w:val="clear" w:color="auto" w:fill="FFFFFF"/>
+          <w:lang w:val="ru-RU"/>
+        </w:rPr>
+        <w:t xml:space="preserve"> </w:t>
+      </w:r>
+      <w:r>
+        <w:rPr>
+          <w:rFonts w:ascii="Times New Roman" w:eastAsia="Segoe UI" w:hAnsi="Times New Roman"/>
+          <w:color w:val="0F1115"/>
+          <w:sz w:val="32"/>
+          <w:szCs w:val="32"/>
+          <w:shd w:val="clear" w:color="auto" w:fill="FFFFFF"/>
+          <w:lang w:val="ru-RU"/>
+        </w:rPr>
+        <w:t>как удвоенный размер кэша</w:t>
+      </w:r>
+      <w:r>
+        <w:rPr>
+          <w:rFonts w:ascii="Times New Roman" w:eastAsia="Segoe UI" w:hAnsi="Times New Roman"/>
+          <w:color w:val="0F1115"/>
+          <w:sz w:val="32"/>
+          <w:szCs w:val="32"/>
+          <w:shd w:val="clear" w:color="auto" w:fill="FFFFFF"/>
+          <w:lang w:val="ru-RU"/>
+        </w:rPr>
+        <w:t xml:space="preserve">: </w:t>
+      </w:r>
+      <w:r>
+        <w:rPr>
+          <w:rFonts w:ascii="Times New Roman" w:eastAsia="Segoe UI" w:hAnsi="Times New Roman"/>
+          <w:color w:val="0F1115"/>
+          <w:sz w:val="32"/>
+          <w:szCs w:val="32"/>
+          <w:shd w:val="clear" w:color="auto" w:fill="FFFFFF"/>
+          <w:lang w:val="ru-RU"/>
+        </w:rPr>
+        <w:t>96</w:t>
+      </w:r>
+      <w:r>
+        <w:rPr>
+          <w:rFonts w:ascii="Times New Roman" w:eastAsia="Segoe UI" w:hAnsi="Times New Roman"/>
+          <w:color w:val="0F1115"/>
+          <w:sz w:val="32"/>
+          <w:szCs w:val="32"/>
+          <w:shd w:val="clear" w:color="auto" w:fill="FFFFFF"/>
+          <w:lang w:val="ru-RU"/>
+        </w:rPr>
+        <w:t>К</w:t>
+      </w:r>
+      <w:r>
+        <w:rPr>
+          <w:rFonts w:ascii="Times New Roman" w:eastAsia="Segoe UI" w:hAnsi="Times New Roman"/>
+          <w:color w:val="0F1115"/>
+          <w:sz w:val="32"/>
+          <w:szCs w:val="32"/>
+          <w:shd w:val="clear" w:color="auto" w:fill="FFFFFF"/>
+          <w:lang w:val="ru-RU"/>
+        </w:rPr>
+        <w:t>Б</w:t>
+      </w:r>
+      <w:bookmarkEnd w:id="1"/>
+      <w:r>
+        <w:rPr>
+          <w:rFonts w:ascii="Times New Roman" w:eastAsia="Segoe UI" w:hAnsi="Times New Roman"/>
+          <w:color w:val="0F1115"/>
+          <w:sz w:val="32"/>
+          <w:szCs w:val="32"/>
+          <w:shd w:val="clear" w:color="auto" w:fill="FFFFFF"/>
+          <w:lang w:val="ru-RU"/>
+        </w:rPr>
+        <w:t>, 1024</w:t>
+      </w:r>
+      <w:r>
+        <w:rPr>
+          <w:rFonts w:ascii="Times New Roman" w:eastAsia="Segoe UI" w:hAnsi="Times New Roman"/>
+          <w:color w:val="0F1115"/>
+          <w:sz w:val="32"/>
+          <w:szCs w:val="32"/>
+          <w:shd w:val="clear" w:color="auto" w:fill="FFFFFF"/>
+          <w:lang w:val="ru-RU"/>
+        </w:rPr>
+        <w:t>КБ</w:t>
+      </w:r>
+      <w:r>
+        <w:rPr>
+          <w:rFonts w:ascii="Times New Roman" w:eastAsia="Segoe UI" w:hAnsi="Times New Roman"/>
+          <w:color w:val="0F1115"/>
+          <w:sz w:val="32"/>
+          <w:szCs w:val="32"/>
+          <w:shd w:val="clear" w:color="auto" w:fill="FFFFFF"/>
+          <w:lang w:val="ru-RU"/>
+        </w:rPr>
+        <w:t>, 12МБ.</w:t>
       </w:r>
     </w:p>
     <w:p>
@@ -673,169 +837,7 @@
         <w:ind w:firstLineChars="137" w:firstLine="438"/>
         <w:jc w:val="both"/>
         <w:rPr>
-          <w:rFonts w:ascii="Times New Roman" w:eastAsia="Segoe UI" w:hAnsi="Times New Roman"/>
-          <w:color w:val="0F1115"/>
-          <w:sz w:val="32"/>
-          <w:szCs w:val="32"/>
-          <w:shd w:val="clear" w:color="auto" w:fill="FFFFFF"/>
-          <w:lang w:val="ru-RU"/>
-        </w:rPr>
-      </w:pPr>
-      <w:r>
-        <w:rPr>
-          <w:rFonts w:ascii="Times New Roman" w:eastAsia="Segoe UI" w:hAnsi="Times New Roman"/>
-          <w:color w:val="0F1115"/>
-          <w:sz w:val="32"/>
-          <w:szCs w:val="32"/>
-          <w:shd w:val="clear" w:color="auto" w:fill="FFFFFF"/>
-          <w:lang w:val="ru-RU"/>
-        </w:rPr>
-        <w:t>О</w:t>
-      </w:r>
-      <w:r>
-        <w:rPr>
-          <w:rFonts w:ascii="Times New Roman" w:eastAsia="Segoe UI" w:hAnsi="Times New Roman"/>
-          <w:color w:val="0F1115"/>
-          <w:sz w:val="32"/>
-          <w:szCs w:val="32"/>
-          <w:shd w:val="clear" w:color="auto" w:fill="FFFFFF"/>
-          <w:lang w:val="ru-RU"/>
-        </w:rPr>
-        <w:t>жидаем</w:t>
-      </w:r>
-      <w:r>
-        <w:rPr>
-          <w:rFonts w:ascii="Times New Roman" w:eastAsia="Segoe UI" w:hAnsi="Times New Roman"/>
-          <w:color w:val="0F1115"/>
-          <w:sz w:val="32"/>
-          <w:szCs w:val="32"/>
-          <w:shd w:val="clear" w:color="auto" w:fill="FFFFFF"/>
-          <w:lang w:val="ru-RU"/>
-        </w:rPr>
-        <w:t>ые</w:t>
-      </w:r>
-      <w:r>
-        <w:rPr>
-          <w:rFonts w:ascii="Times New Roman" w:eastAsia="Segoe UI" w:hAnsi="Times New Roman"/>
-          <w:color w:val="0F1115"/>
-          <w:sz w:val="32"/>
-          <w:szCs w:val="32"/>
-          <w:shd w:val="clear" w:color="auto" w:fill="FFFFFF"/>
-          <w:lang w:val="ru-RU"/>
-        </w:rPr>
-        <w:t xml:space="preserve"> результатами теста</w:t>
-      </w:r>
-      <w:r>
-        <w:rPr>
-          <w:rFonts w:ascii="Times New Roman" w:eastAsia="Segoe UI" w:hAnsi="Times New Roman"/>
-          <w:color w:val="0F1115"/>
-          <w:sz w:val="32"/>
-          <w:szCs w:val="32"/>
-          <w:shd w:val="clear" w:color="auto" w:fill="FFFFFF"/>
-          <w:lang w:val="ru-RU"/>
-        </w:rPr>
-        <w:t>:</w:t>
-      </w:r>
-    </w:p>
-    <w:p>
-      <w:pPr>
-        <w:pStyle w:val="a8"/>
-        <w:numPr>
-          <w:ilvl w:val="0"/>
-          <w:numId w:val="3"/>
-        </w:numPr>
-        <w:spacing w:line="360" w:lineRule="auto"/>
-        <w:rPr>
-          <w:rFonts w:ascii="Times New Roman" w:hAnsi="Times New Roman" w:cs="Times New Roman"/>
-          <w:sz w:val="32"/>
-          <w:szCs w:val="32"/>
-          <w:lang w:val="ru-RU"/>
-        </w:rPr>
-      </w:pPr>
-      <w:r>
-        <w:rPr>
-          <w:rFonts w:ascii="Times New Roman" w:hAnsi="Times New Roman" w:cs="Times New Roman"/>
-          <w:sz w:val="32"/>
-          <w:szCs w:val="32"/>
-          <w:lang w:val="en-US"/>
-        </w:rPr>
-        <w:t>L1: 8</w:t>
-      </w:r>
-    </w:p>
-    <w:p>
-      <w:pPr>
-        <w:pStyle w:val="a8"/>
-        <w:numPr>
-          <w:ilvl w:val="0"/>
-          <w:numId w:val="3"/>
-        </w:numPr>
-        <w:spacing w:line="360" w:lineRule="auto"/>
-        <w:rPr>
-          <w:rFonts w:ascii="Times New Roman" w:hAnsi="Times New Roman" w:cs="Times New Roman"/>
-          <w:sz w:val="32"/>
-          <w:szCs w:val="32"/>
-          <w:lang w:val="ru-RU"/>
-        </w:rPr>
-      </w:pPr>
-      <w:r>
-        <w:rPr>
-          <w:rFonts w:ascii="Times New Roman" w:hAnsi="Times New Roman" w:cs="Times New Roman"/>
-          <w:sz w:val="32"/>
-          <w:szCs w:val="32"/>
-          <w:lang w:val="en-US"/>
-        </w:rPr>
-        <w:t>L2: 4</w:t>
-      </w:r>
-    </w:p>
-    <w:p>
-      <w:pPr>
-        <w:pStyle w:val="a8"/>
-        <w:numPr>
-          <w:ilvl w:val="0"/>
-          <w:numId w:val="3"/>
-        </w:numPr>
-        <w:spacing w:line="360" w:lineRule="auto"/>
-        <w:rPr>
-          <w:rFonts w:ascii="Times New Roman" w:hAnsi="Times New Roman" w:cs="Times New Roman"/>
-          <w:sz w:val="32"/>
-          <w:szCs w:val="32"/>
-          <w:lang w:val="ru-RU"/>
-        </w:rPr>
-      </w:pPr>
-      <w:r>
-        <w:rPr>
-          <w:rFonts w:ascii="Times New Roman" w:hAnsi="Times New Roman" w:cs="Times New Roman"/>
-          <w:sz w:val="32"/>
-          <w:szCs w:val="32"/>
-          <w:lang w:val="en-US"/>
-        </w:rPr>
-        <w:t>L3: 12</w:t>
-      </w:r>
-    </w:p>
-    <w:p>
-      <w:pPr>
-        <w:pStyle w:val="a5"/>
-        <w:shd w:val="clear" w:color="auto" w:fill="FFFFFF"/>
-        <w:spacing w:before="192" w:after="192" w:line="360" w:lineRule="auto"/>
-        <w:jc w:val="both"/>
-        <w:rPr>
-          <w:rFonts w:ascii="Times New Roman" w:eastAsia="Segoe UI" w:hAnsi="Times New Roman"/>
-          <w:color w:val="0F1115"/>
-          <w:sz w:val="32"/>
-          <w:szCs w:val="32"/>
-          <w:shd w:val="clear" w:color="auto" w:fill="FFFFFF"/>
-          <w:lang w:val="ru-RU"/>
-        </w:rPr>
-      </w:pPr>
-    </w:p>
-    <w:p>
-      <w:pPr>
-        <w:pStyle w:val="a5"/>
-        <w:shd w:val="clear" w:color="auto" w:fill="FFFFFF"/>
-        <w:spacing w:before="192" w:after="192" w:line="360" w:lineRule="auto"/>
-        <w:jc w:val="both"/>
-        <w:rPr>
-          <w:rFonts w:ascii="Times New Roman" w:eastAsia="Segoe UI" w:hAnsi="Times New Roman"/>
+          <w:rFonts w:ascii="Times New Roman" w:eastAsia="Segoe UI" w:hAnsi="Times New Roman" w:cs="Times New Roman"/>
           <w:color w:val="0F1115"/>
           <w:sz w:val="32"/>
           <w:szCs w:val="32"/>
@@ -852,7 +854,7 @@
         <w:ind w:firstLineChars="137" w:firstLine="438"/>
         <w:jc w:val="both"/>
         <w:rPr>
-          <w:rFonts w:ascii="Times New Roman" w:eastAsia="Segoe UI" w:hAnsi="Times New Roman"/>
+          <w:rFonts w:ascii="Times New Roman" w:eastAsia="Segoe UI" w:hAnsi="Times New Roman" w:cs="Times New Roman"/>
           <w:color w:val="0F1115"/>
           <w:sz w:val="32"/>
           <w:szCs w:val="32"/>
@@ -862,26 +864,113 @@
       </w:pPr>
       <w:r>
         <w:rPr>
-          <w:rFonts w:ascii="Times New Roman" w:eastAsia="Segoe UI" w:hAnsi="Times New Roman"/>
+          <w:rFonts w:ascii="Times New Roman" w:eastAsia="Segoe UI" w:hAnsi="Times New Roman" w:cs="Times New Roman"/>
           <w:color w:val="0F1115"/>
           <w:sz w:val="32"/>
           <w:szCs w:val="32"/>
           <w:shd w:val="clear" w:color="auto" w:fill="FFFFFF"/>
           <w:lang w:val="ru-RU"/>
         </w:rPr>
-        <w:lastRenderedPageBreak/>
-        <w:t>После нескольких попыток подбора размера массива было выбрано значение 128К</w:t>
+        <w:t xml:space="preserve"> </w:t>
       </w:r>
       <w:r>
         <w:rPr>
-          <w:rFonts w:ascii="Times New Roman" w:eastAsia="Segoe UI" w:hAnsi="Times New Roman"/>
+          <w:rFonts w:ascii="Times New Roman" w:eastAsia="Segoe UI" w:hAnsi="Times New Roman" w:cs="Times New Roman"/>
           <w:color w:val="0F1115"/>
           <w:sz w:val="32"/>
           <w:szCs w:val="32"/>
           <w:shd w:val="clear" w:color="auto" w:fill="FFFFFF"/>
           <w:lang w:val="ru-RU"/>
         </w:rPr>
-        <w:t>Б исходя из лучшей наглядности.</w:t>
+        <w:t>По результатам теста был</w:t>
+      </w:r>
+      <w:r>
+        <w:rPr>
+          <w:rFonts w:ascii="Times New Roman" w:eastAsia="Segoe UI" w:hAnsi="Times New Roman" w:cs="Times New Roman"/>
+          <w:color w:val="0F1115"/>
+          <w:sz w:val="32"/>
+          <w:szCs w:val="32"/>
+          <w:shd w:val="clear" w:color="auto" w:fill="FFFFFF"/>
+          <w:lang w:val="ru-RU"/>
+        </w:rPr>
+        <w:t>и</w:t>
+      </w:r>
+      <w:r>
+        <w:rPr>
+          <w:rFonts w:ascii="Times New Roman" w:eastAsia="Segoe UI" w:hAnsi="Times New Roman" w:cs="Times New Roman"/>
+          <w:color w:val="0F1115"/>
+          <w:sz w:val="32"/>
+          <w:szCs w:val="32"/>
+          <w:shd w:val="clear" w:color="auto" w:fill="FFFFFF"/>
+          <w:lang w:val="ru-RU"/>
+        </w:rPr>
+        <w:t xml:space="preserve"> получен</w:t>
+      </w:r>
+      <w:r>
+        <w:rPr>
+          <w:rFonts w:ascii="Times New Roman" w:eastAsia="Segoe UI" w:hAnsi="Times New Roman" w:cs="Times New Roman"/>
+          <w:color w:val="0F1115"/>
+          <w:sz w:val="32"/>
+          <w:szCs w:val="32"/>
+          <w:shd w:val="clear" w:color="auto" w:fill="FFFFFF"/>
+          <w:lang w:val="ru-RU"/>
+        </w:rPr>
+        <w:t>ы</w:t>
+      </w:r>
+      <w:r>
+        <w:rPr>
+          <w:rFonts w:ascii="Times New Roman" w:eastAsia="Segoe UI" w:hAnsi="Times New Roman" w:cs="Times New Roman"/>
+          <w:color w:val="0F1115"/>
+          <w:sz w:val="32"/>
+          <w:szCs w:val="32"/>
+          <w:shd w:val="clear" w:color="auto" w:fill="FFFFFF"/>
+          <w:lang w:val="ru-RU"/>
+        </w:rPr>
+        <w:t xml:space="preserve"> и проанализирован</w:t>
+      </w:r>
+      <w:r>
+        <w:rPr>
+          <w:rFonts w:ascii="Times New Roman" w:eastAsia="Segoe UI" w:hAnsi="Times New Roman" w:cs="Times New Roman"/>
+          <w:color w:val="0F1115"/>
+          <w:sz w:val="32"/>
+          <w:szCs w:val="32"/>
+          <w:shd w:val="clear" w:color="auto" w:fill="FFFFFF"/>
+          <w:lang w:val="ru-RU"/>
+        </w:rPr>
+        <w:t>ы</w:t>
+      </w:r>
+      <w:r>
+        <w:rPr>
+          <w:rFonts w:ascii="Times New Roman" w:eastAsia="Segoe UI" w:hAnsi="Times New Roman" w:cs="Times New Roman"/>
+          <w:color w:val="0F1115"/>
+          <w:sz w:val="32"/>
+          <w:szCs w:val="32"/>
+          <w:shd w:val="clear" w:color="auto" w:fill="FFFFFF"/>
+          <w:lang w:val="ru-RU"/>
+        </w:rPr>
+        <w:t xml:space="preserve"> график</w:t>
+      </w:r>
+      <w:r>
+        <w:rPr>
+          <w:rFonts w:ascii="Times New Roman" w:eastAsia="Segoe UI" w:hAnsi="Times New Roman" w:cs="Times New Roman"/>
+          <w:color w:val="0F1115"/>
+          <w:sz w:val="32"/>
+          <w:szCs w:val="32"/>
+          <w:shd w:val="clear" w:color="auto" w:fill="FFFFFF"/>
+          <w:lang w:val="ru-RU"/>
+        </w:rPr>
+        <w:t>и</w:t>
+      </w:r>
+      <w:r>
+        <w:rPr>
+          <w:rFonts w:ascii="Times New Roman" w:eastAsia="Segoe UI" w:hAnsi="Times New Roman" w:cs="Times New Roman"/>
+          <w:color w:val="0F1115"/>
+          <w:sz w:val="32"/>
+          <w:szCs w:val="32"/>
+          <w:shd w:val="clear" w:color="auto" w:fill="FFFFFF"/>
+          <w:lang w:val="ru-RU"/>
+        </w:rPr>
+        <w:t>:</w:t>
       </w:r>
     </w:p>
     <w:p>
@@ -897,7 +986,58 @@
           <w:sz w:val="32"/>
           <w:szCs w:val="32"/>
           <w:shd w:val="clear" w:color="auto" w:fill="FFFFFF"/>
-          <w:lang w:val="ru-RU"/>
+          <w:lang w:val="en-US"/>
+        </w:rPr>
+      </w:pPr>
+    </w:p>
+    <w:p>
+      <w:pPr>
+        <w:pStyle w:val="a5"/>
+        <w:shd w:val="clear" w:color="auto" w:fill="FFFFFF"/>
+        <w:spacing w:before="192" w:after="192" w:line="360" w:lineRule="auto"/>
+        <w:ind w:firstLineChars="137" w:firstLine="438"/>
+        <w:jc w:val="both"/>
+        <w:rPr>
+          <w:rFonts w:ascii="Times New Roman" w:eastAsia="Segoe UI" w:hAnsi="Times New Roman" w:cs="Times New Roman"/>
+          <w:color w:val="0F1115"/>
+          <w:sz w:val="32"/>
+          <w:szCs w:val="32"/>
+          <w:shd w:val="clear" w:color="auto" w:fill="FFFFFF"/>
+          <w:lang w:val="en-US"/>
+        </w:rPr>
+      </w:pPr>
+    </w:p>
+    <w:p>
+      <w:pPr>
+        <w:pStyle w:val="a5"/>
+        <w:shd w:val="clear" w:color="auto" w:fill="FFFFFF"/>
+        <w:spacing w:before="192" w:after="192" w:line="360" w:lineRule="auto"/>
+        <w:ind w:firstLineChars="137" w:firstLine="438"/>
+        <w:jc w:val="both"/>
+        <w:rPr>
+          <w:rFonts w:ascii="Times New Roman" w:eastAsia="Segoe UI" w:hAnsi="Times New Roman" w:cs="Times New Roman"/>
+          <w:color w:val="0F1115"/>
+          <w:sz w:val="32"/>
+          <w:szCs w:val="32"/>
+          <w:shd w:val="clear" w:color="auto" w:fill="FFFFFF"/>
+          <w:lang w:val="en-US"/>
+        </w:rPr>
+      </w:pPr>
+    </w:p>
+    <w:p>
+      <w:pPr>
+        <w:pStyle w:val="a5"/>
+        <w:shd w:val="clear" w:color="auto" w:fill="FFFFFF"/>
+        <w:spacing w:before="192" w:after="192" w:line="360" w:lineRule="auto"/>
+        <w:ind w:firstLineChars="137" w:firstLine="438"/>
+        <w:jc w:val="both"/>
+        <w:rPr>
+          <w:rFonts w:ascii="Times New Roman" w:eastAsia="Segoe UI" w:hAnsi="Times New Roman" w:cs="Times New Roman"/>
+          <w:color w:val="0F1115"/>
+          <w:sz w:val="32"/>
+          <w:szCs w:val="32"/>
+          <w:shd w:val="clear" w:color="auto" w:fill="FFFFFF"/>
+          <w:lang w:val="en-US"/>
         </w:rPr>
       </w:pPr>
       <w:r>
@@ -907,13 +1047,43 @@
           <w:sz w:val="32"/>
           <w:szCs w:val="32"/>
           <w:shd w:val="clear" w:color="auto" w:fill="FFFFFF"/>
-          <w:lang w:val="ru-RU"/>
+          <w:lang w:val="en-US"/>
+        </w:rPr>
+        <w:lastRenderedPageBreak/>
+        <w:t>L1:</w:t>
+      </w:r>
+    </w:p>
+    <w:p>
+      <w:pPr>
+        <w:pStyle w:val="a5"/>
+        <w:shd w:val="clear" w:color="auto" w:fill="FFFFFF"/>
+        <w:spacing w:before="192" w:after="192" w:line="360" w:lineRule="auto"/>
+        <w:ind w:firstLineChars="137" w:firstLine="438"/>
+        <w:jc w:val="both"/>
+        <w:rPr>
+          <w:rFonts w:ascii="Times New Roman" w:eastAsia="Segoe UI" w:hAnsi="Times New Roman" w:cs="Times New Roman"/>
+          <w:color w:val="0F1115"/>
+          <w:sz w:val="32"/>
+          <w:szCs w:val="32"/>
+          <w:shd w:val="clear" w:color="auto" w:fill="FFFFFF"/>
+          <w:lang w:val="en-US"/>
+        </w:rPr>
+      </w:pPr>
+      <w:r>
+        <w:rPr>
+          <w:rFonts w:ascii="Times New Roman" w:eastAsia="Segoe UI" w:hAnsi="Times New Roman" w:cs="Times New Roman"/>
+          <w:noProof/>
+          <w:color w:val="0F1115"/>
+          <w:sz w:val="32"/>
+          <w:szCs w:val="32"/>
+          <w:shd w:val="clear" w:color="auto" w:fill="FFFFFF"/>
+          <w:lang w:val="en-US"/>
         </w:rPr>
         <w:drawing>
-          <wp:inline distT="0" distB="0" distL="0" distR="0" wp14:anchorId="2FC2EBD1" wp14:editId="26E6B031">
-            <wp:extent cx="5745524" cy="2887980"/>
-            <wp:effectExtent l="0" t="0" r="7620" b="7620"/>
-            <wp:docPr id="1" name="Рисунок 1"/>
+          <wp:inline distT="0" distB="0" distL="0" distR="0" wp14:anchorId="1EC0D657" wp14:editId="33B80030">
+            <wp:extent cx="4757057" cy="3799460"/>
+            <wp:effectExtent l="0" t="0" r="5715" b="0"/>
+            <wp:docPr id="4" name="Рисунок 4"/>
             <wp:cNvGraphicFramePr>
               <a:graphicFrameLocks xmlns:a="http://schemas.openxmlformats.org/drawingml/2006/main" noChangeAspect="1"/>
             </wp:cNvGraphicFramePr>
@@ -921,23 +1091,36 @@
               <a:graphicData uri="http://schemas.openxmlformats.org/drawingml/2006/picture">
                 <pic:pic xmlns:pic="http://schemas.openxmlformats.org/drawingml/2006/picture">
                   <pic:nvPicPr>
-                    <pic:cNvPr id="1" name=""/>
-                    <pic:cNvPicPr/>
+                    <pic:cNvPr id="0" name="Picture 3"/>
+                    <pic:cNvPicPr>
+                      <a:picLocks noChangeAspect="1" noChangeArrowheads="1"/>
+                    </pic:cNvPicPr>
                   </pic:nvPicPr>
                   <pic:blipFill>
-                    <a:blip r:embed="rId7"/>
+                    <a:blip r:embed="rId8" cstate="print">
+                      <a:extLst>
+                        <a:ext uri="{28A0092B-C50C-407E-A947-70E740481C1C}">
+                          <a14:useLocalDpi xmlns:a14="http://schemas.microsoft.com/office/drawing/2010/main" val="0"/>
+                        </a:ext>
+                      </a:extLst>
+                    </a:blip>
+                    <a:srcRect/>
                     <a:stretch>
                       <a:fillRect/>
                     </a:stretch>
                   </pic:blipFill>
-                  <pic:spPr>
+                  <pic:spPr bwMode="auto">
                     <a:xfrm>
                       <a:off x="0" y="0"/>
-                      <a:ext cx="5757266" cy="2893882"/>
+                      <a:ext cx="4835502" cy="3862114"/>
                     </a:xfrm>
                     <a:prstGeom prst="rect">
                       <a:avLst/>
                     </a:prstGeom>
+                    <a:noFill/>
+                    <a:ln>
+                      <a:noFill/>
+                    </a:ln>
                   </pic:spPr>
                 </pic:pic>
               </a:graphicData>
@@ -945,17 +1128,23 @@
           </wp:inline>
         </w:drawing>
       </w:r>
-      <w:r>
+    </w:p>
+    <w:p>
+      <w:pPr>
+        <w:pStyle w:val="a5"/>
+        <w:shd w:val="clear" w:color="auto" w:fill="FFFFFF"/>
+        <w:spacing w:before="192" w:after="192" w:line="360" w:lineRule="auto"/>
+        <w:ind w:firstLineChars="137" w:firstLine="438"/>
+        <w:jc w:val="both"/>
         <w:rPr>
           <w:rFonts w:ascii="Times New Roman" w:eastAsia="Segoe UI" w:hAnsi="Times New Roman" w:cs="Times New Roman"/>
           <w:color w:val="0F1115"/>
           <w:sz w:val="32"/>
           <w:szCs w:val="32"/>
           <w:shd w:val="clear" w:color="auto" w:fill="FFFFFF"/>
-          <w:lang w:val="ru-RU"/>
-        </w:rPr>
-        <w:t xml:space="preserve"> </w:t>
-      </w:r>
+          <w:lang w:val="en-US"/>
+        </w:rPr>
+      </w:pPr>
       <w:r>
         <w:rPr>
           <w:rFonts w:ascii="Times New Roman" w:eastAsia="Segoe UI" w:hAnsi="Times New Roman" w:cs="Times New Roman"/>
@@ -963,11 +1152,18 @@
           <w:sz w:val="32"/>
           <w:szCs w:val="32"/>
           <w:shd w:val="clear" w:color="auto" w:fill="FFFFFF"/>
-          <w:lang w:val="ru-RU"/>
-        </w:rPr>
-        <w:t xml:space="preserve">По результатам теста был </w:t>
+          <w:lang w:val="en-US"/>
+        </w:rPr>
+        <w:t>L2:</w:t>
       </w:r>
-      <w:r>
+    </w:p>
+    <w:p>
+      <w:pPr>
+        <w:pStyle w:val="a5"/>
+        <w:shd w:val="clear" w:color="auto" w:fill="FFFFFF"/>
+        <w:spacing w:before="192" w:after="192" w:line="360" w:lineRule="auto"/>
+        <w:ind w:firstLineChars="137" w:firstLine="438"/>
+        <w:jc w:val="both"/>
         <w:rPr>
           <w:rFonts w:ascii="Times New Roman" w:eastAsia="Segoe UI" w:hAnsi="Times New Roman" w:cs="Times New Roman"/>
           <w:color w:val="0F1115"/>
@@ -976,18 +1172,170 @@
           <w:shd w:val="clear" w:color="auto" w:fill="FFFFFF"/>
           <w:lang w:val="ru-RU"/>
         </w:rPr>
-        <w:t>получен и проанализирован график</w:t>
+      </w:pPr>
+      <w:r>
+        <w:rPr>
+          <w:rFonts w:ascii="Times New Roman" w:eastAsia="Segoe UI" w:hAnsi="Times New Roman" w:cs="Times New Roman"/>
+          <w:noProof/>
+          <w:color w:val="0F1115"/>
+          <w:sz w:val="32"/>
+          <w:szCs w:val="32"/>
+          <w:shd w:val="clear" w:color="auto" w:fill="FFFFFF"/>
+          <w:lang w:val="ru-RU"/>
+        </w:rPr>
+        <w:drawing>
+          <wp:inline distT="0" distB="0" distL="0" distR="0" wp14:anchorId="75CA2128" wp14:editId="393F6CA3">
+            <wp:extent cx="4740728" cy="3786418"/>
+            <wp:effectExtent l="0" t="0" r="3175" b="5080"/>
+            <wp:docPr id="3" name="Рисунок 3"/>
+            <wp:cNvGraphicFramePr>
+              <a:graphicFrameLocks xmlns:a="http://schemas.openxmlformats.org/drawingml/2006/main" noChangeAspect="1"/>
+            </wp:cNvGraphicFramePr>
+            <a:graphic xmlns:a="http://schemas.openxmlformats.org/drawingml/2006/main">
+              <a:graphicData uri="http://schemas.openxmlformats.org/drawingml/2006/picture">
+                <pic:pic xmlns:pic="http://schemas.openxmlformats.org/drawingml/2006/picture">
+                  <pic:nvPicPr>
+                    <pic:cNvPr id="0" name="Picture 2"/>
+                    <pic:cNvPicPr>
+                      <a:picLocks noChangeAspect="1" noChangeArrowheads="1"/>
+                    </pic:cNvPicPr>
+                  </pic:nvPicPr>
+                  <pic:blipFill>
+                    <a:blip r:embed="rId9" cstate="print">
+                      <a:extLst>
+                        <a:ext uri="{28A0092B-C50C-407E-A947-70E740481C1C}">
+                          <a14:useLocalDpi xmlns:a14="http://schemas.microsoft.com/office/drawing/2010/main" val="0"/>
+                        </a:ext>
+                      </a:extLst>
+                    </a:blip>
+                    <a:srcRect/>
+                    <a:stretch>
+                      <a:fillRect/>
+                    </a:stretch>
+                  </pic:blipFill>
+                  <pic:spPr bwMode="auto">
+                    <a:xfrm>
+                      <a:off x="0" y="0"/>
+                      <a:ext cx="4743354" cy="3788515"/>
+                    </a:xfrm>
+                    <a:prstGeom prst="rect">
+                      <a:avLst/>
+                    </a:prstGeom>
+                    <a:noFill/>
+                    <a:ln>
+                      <a:noFill/>
+                    </a:ln>
+                  </pic:spPr>
+                </pic:pic>
+              </a:graphicData>
+            </a:graphic>
+          </wp:inline>
+        </w:drawing>
       </w:r>
-      <w:r>
+    </w:p>
+    <w:p>
+      <w:pPr>
+        <w:pStyle w:val="a5"/>
+        <w:shd w:val="clear" w:color="auto" w:fill="FFFFFF"/>
+        <w:spacing w:before="192" w:after="192" w:line="360" w:lineRule="auto"/>
+        <w:ind w:firstLineChars="137" w:firstLine="438"/>
+        <w:jc w:val="both"/>
         <w:rPr>
           <w:rFonts w:ascii="Times New Roman" w:eastAsia="Segoe UI" w:hAnsi="Times New Roman" w:cs="Times New Roman"/>
           <w:color w:val="0F1115"/>
           <w:sz w:val="32"/>
           <w:szCs w:val="32"/>
           <w:shd w:val="clear" w:color="auto" w:fill="FFFFFF"/>
+          <w:lang w:val="en-US"/>
+        </w:rPr>
+      </w:pPr>
+      <w:r>
+        <w:rPr>
+          <w:rFonts w:ascii="Times New Roman" w:eastAsia="Segoe UI" w:hAnsi="Times New Roman" w:cs="Times New Roman"/>
+          <w:color w:val="0F1115"/>
+          <w:sz w:val="32"/>
+          <w:szCs w:val="32"/>
+          <w:shd w:val="clear" w:color="auto" w:fill="FFFFFF"/>
+          <w:lang w:val="en-US"/>
+        </w:rPr>
+        <w:lastRenderedPageBreak/>
+        <w:t>L3:</w:t>
+      </w:r>
+    </w:p>
+    <w:p>
+      <w:pPr>
+        <w:pStyle w:val="a5"/>
+        <w:shd w:val="clear" w:color="auto" w:fill="FFFFFF"/>
+        <w:spacing w:before="192" w:after="192" w:line="360" w:lineRule="auto"/>
+        <w:ind w:firstLineChars="137" w:firstLine="438"/>
+        <w:jc w:val="both"/>
+        <w:rPr>
+          <w:rFonts w:ascii="Times New Roman" w:eastAsia="Segoe UI" w:hAnsi="Times New Roman" w:cs="Times New Roman"/>
+          <w:color w:val="0F1115"/>
+          <w:sz w:val="32"/>
+          <w:szCs w:val="32"/>
+          <w:shd w:val="clear" w:color="auto" w:fill="FFFFFF"/>
           <w:lang w:val="ru-RU"/>
         </w:rPr>
-        <w:t>:</w:t>
+      </w:pPr>
+      <w:r>
+        <w:rPr>
+          <w:rFonts w:ascii="Times New Roman" w:eastAsia="Segoe UI" w:hAnsi="Times New Roman" w:cs="Times New Roman"/>
+          <w:noProof/>
+          <w:color w:val="0F1115"/>
+          <w:sz w:val="32"/>
+          <w:szCs w:val="32"/>
+          <w:shd w:val="clear" w:color="auto" w:fill="FFFFFF"/>
+          <w:lang w:val="ru-RU"/>
+        </w:rPr>
+        <w:drawing>
+          <wp:inline distT="0" distB="0" distL="0" distR="0" wp14:anchorId="6F80FEF5" wp14:editId="0856F98E">
+            <wp:extent cx="4914900" cy="3925529"/>
+            <wp:effectExtent l="0" t="0" r="0" b="0"/>
+            <wp:docPr id="5" name="Рисунок 5"/>
+            <wp:cNvGraphicFramePr>
+              <a:graphicFrameLocks xmlns:a="http://schemas.openxmlformats.org/drawingml/2006/main" noChangeAspect="1"/>
+            </wp:cNvGraphicFramePr>
+            <a:graphic xmlns:a="http://schemas.openxmlformats.org/drawingml/2006/main">
+              <a:graphicData uri="http://schemas.openxmlformats.org/drawingml/2006/picture">
+                <pic:pic xmlns:pic="http://schemas.openxmlformats.org/drawingml/2006/picture">
+                  <pic:nvPicPr>
+                    <pic:cNvPr id="0" name="Picture 4"/>
+                    <pic:cNvPicPr>
+                      <a:picLocks noChangeAspect="1" noChangeArrowheads="1"/>
+                    </pic:cNvPicPr>
+                  </pic:nvPicPr>
+                  <pic:blipFill>
+                    <a:blip r:embed="rId10" cstate="print">
+                      <a:extLst>
+                        <a:ext uri="{28A0092B-C50C-407E-A947-70E740481C1C}">
+                          <a14:useLocalDpi xmlns:a14="http://schemas.microsoft.com/office/drawing/2010/main" val="0"/>
+                        </a:ext>
+                      </a:extLst>
+                    </a:blip>
+                    <a:srcRect/>
+                    <a:stretch>
+                      <a:fillRect/>
+                    </a:stretch>
+                  </pic:blipFill>
+                  <pic:spPr bwMode="auto">
+                    <a:xfrm>
+                      <a:off x="0" y="0"/>
+                      <a:ext cx="4924676" cy="3933337"/>
+                    </a:xfrm>
+                    <a:prstGeom prst="rect">
+                      <a:avLst/>
+                    </a:prstGeom>
+                    <a:noFill/>
+                    <a:ln>
+                      <a:noFill/>
+                    </a:ln>
+                  </pic:spPr>
+                </pic:pic>
+              </a:graphicData>
+            </a:graphic>
+          </wp:inline>
+        </w:drawing>
       </w:r>
     </w:p>
     <w:p>
@@ -1036,10 +1384,8 @@
           <w:shd w:val="clear" w:color="auto" w:fill="FFFFFF"/>
           <w:lang w:val="ru-RU"/>
         </w:rPr>
-        <w:t>исходя из граф</w:t>
+        <w:t>исходя из график</w:t>
       </w:r>
-      <w:bookmarkStart w:id="0" w:name="_GoBack"/>
-      <w:bookmarkEnd w:id="0"/>
       <w:r>
         <w:rPr>
           <w:rFonts w:ascii="Times New Roman" w:eastAsia="Segoe UI" w:hAnsi="Times New Roman" w:cs="Times New Roman"/>
@@ -1049,7 +1395,7 @@
           <w:shd w:val="clear" w:color="auto" w:fill="FFFFFF"/>
           <w:lang w:val="ru-RU"/>
         </w:rPr>
-        <w:t>ика</w:t>
+        <w:t>ов</w:t>
       </w:r>
       <w:r>
         <w:rPr>
@@ -1094,23 +1440,48 @@
           <w:szCs w:val="32"/>
           <w:lang w:val="ru-RU"/>
         </w:rPr>
-        <w:t>1</w:t>
+        <w:t xml:space="preserve">1: </w:t>
       </w:r>
       <w:r>
         <w:rPr>
           <w:rFonts w:ascii="Times New Roman" w:hAnsi="Times New Roman" w:cs="Times New Roman"/>
           <w:sz w:val="32"/>
           <w:szCs w:val="32"/>
+          <w:lang w:val="en-US"/>
+        </w:rPr>
+        <w:t>8</w:t>
+      </w:r>
+    </w:p>
+    <w:p>
+      <w:pPr>
+        <w:numPr>
+          <w:ilvl w:val="0"/>
+          <w:numId w:val="2"/>
+        </w:numPr>
+        <w:spacing w:line="360" w:lineRule="auto"/>
+        <w:ind w:firstLineChars="137" w:firstLine="438"/>
+        <w:rPr>
+          <w:rFonts w:ascii="Times New Roman" w:hAnsi="Times New Roman" w:cs="Times New Roman"/>
+          <w:sz w:val="32"/>
+          <w:szCs w:val="32"/>
           <w:lang w:val="ru-RU"/>
         </w:rPr>
-        <w:t xml:space="preserve">: </w:t>
+      </w:pPr>
+      <w:r>
+        <w:rPr>
+          <w:rFonts w:ascii="Times New Roman" w:hAnsi="Times New Roman" w:cs="Times New Roman"/>
+          <w:sz w:val="32"/>
+          <w:szCs w:val="32"/>
+          <w:lang w:val="en-US"/>
+        </w:rPr>
+        <w:t xml:space="preserve">L3: </w:t>
       </w:r>
       <w:r>
         <w:rPr>
           <w:rFonts w:ascii="Times New Roman" w:hAnsi="Times New Roman" w:cs="Times New Roman"/>
           <w:sz w:val="32"/>
           <w:szCs w:val="32"/>
-          <w:lang w:val="ru-RU"/>
+          <w:lang w:val="en-US"/>
         </w:rPr>
         <w:t>4</w:t>
       </w:r>
@@ -1127,7 +1498,7 @@
           <w:rFonts w:ascii="Times New Roman" w:hAnsi="Times New Roman" w:cs="Times New Roman"/>
           <w:sz w:val="32"/>
           <w:szCs w:val="32"/>
-          <w:lang w:val="ru-RU"/>
+          <w:lang w:val="en-US"/>
         </w:rPr>
       </w:pPr>
       <w:r>
@@ -1144,34 +1515,9 @@
           <w:rFonts w:ascii="Times New Roman" w:hAnsi="Times New Roman" w:cs="Times New Roman"/>
           <w:sz w:val="32"/>
           <w:szCs w:val="32"/>
-          <w:lang w:val="ru-RU"/>
-        </w:rPr>
-        <w:t>8</w:t>
-      </w:r>
-    </w:p>
-    <w:p>
-      <w:pPr>
-        <w:numPr>
-          <w:ilvl w:val="0"/>
-          <w:numId w:val="2"/>
-        </w:numPr>
-        <w:spacing w:line="360" w:lineRule="auto"/>
-        <w:ind w:firstLineChars="137" w:firstLine="438"/>
-        <w:rPr>
-          <w:rFonts w:ascii="Times New Roman" w:hAnsi="Times New Roman" w:cs="Times New Roman"/>
-          <w:sz w:val="32"/>
-          <w:szCs w:val="32"/>
           <w:lang w:val="en-US"/>
         </w:rPr>
-      </w:pPr>
-      <w:r>
-        <w:rPr>
-          <w:rFonts w:ascii="Times New Roman" w:hAnsi="Times New Roman" w:cs="Times New Roman"/>
-          <w:sz w:val="32"/>
-          <w:szCs w:val="32"/>
-          <w:lang w:val="en-US"/>
-        </w:rPr>
-        <w:t>L</w:t>
+        <w:t>4</w:t>
       </w:r>
       <w:r>
         <w:rPr>
@@ -1180,248 +1526,8 @@
           <w:szCs w:val="32"/>
           <w:lang w:val="en-US"/>
         </w:rPr>
-        <w:t>3</w:t>
-      </w:r>
-      <w:r>
-        <w:rPr>
-          <w:rFonts w:ascii="Times New Roman" w:hAnsi="Times New Roman" w:cs="Times New Roman"/>
-          <w:sz w:val="32"/>
-          <w:szCs w:val="32"/>
-          <w:lang w:val="en-US"/>
-        </w:rPr>
-        <w:t xml:space="preserve">: </w:t>
-      </w:r>
-      <w:r>
-        <w:rPr>
-          <w:rFonts w:ascii="Times New Roman" w:hAnsi="Times New Roman" w:cs="Times New Roman"/>
-          <w:sz w:val="32"/>
-          <w:szCs w:val="32"/>
-          <w:lang w:val="ru-RU"/>
-        </w:rPr>
-        <w:t>5</w:t>
-      </w:r>
-      <w:r>
-        <w:rPr>
-          <w:rFonts w:ascii="Times New Roman" w:hAnsi="Times New Roman" w:cs="Times New Roman"/>
-          <w:sz w:val="32"/>
-          <w:szCs w:val="32"/>
-          <w:lang w:val="ru-RU"/>
-        </w:rPr>
-        <w:t>2</w:t>
-      </w:r>
-      <w:r>
-        <w:rPr>
-          <w:rFonts w:ascii="Times New Roman" w:hAnsi="Times New Roman" w:cs="Times New Roman"/>
-          <w:sz w:val="32"/>
-          <w:szCs w:val="32"/>
-          <w:lang w:val="en-US"/>
-        </w:rPr>
         <w:t>.</w:t>
       </w:r>
-    </w:p>
-    <w:p>
-      <w:pPr>
-        <w:spacing w:line="360" w:lineRule="auto"/>
-        <w:rPr>
-          <w:rFonts w:ascii="Times New Roman" w:hAnsi="Times New Roman" w:cs="Times New Roman"/>
-          <w:sz w:val="32"/>
-          <w:szCs w:val="32"/>
-          <w:lang w:val="ru-RU"/>
-        </w:rPr>
-      </w:pPr>
-      <w:r>
-        <w:rPr>
-          <w:rFonts w:ascii="Times New Roman" w:hAnsi="Times New Roman" w:cs="Times New Roman"/>
-          <w:sz w:val="32"/>
-          <w:szCs w:val="32"/>
-          <w:lang w:val="ru-RU"/>
-        </w:rPr>
-        <w:t>Ч</w:t>
-      </w:r>
-      <w:r>
-        <w:rPr>
-          <w:rFonts w:ascii="Times New Roman" w:hAnsi="Times New Roman" w:cs="Times New Roman"/>
-          <w:sz w:val="32"/>
-          <w:szCs w:val="32"/>
-          <w:lang w:val="ru-RU"/>
-        </w:rPr>
-        <w:t xml:space="preserve">то </w:t>
-      </w:r>
-      <w:r>
-        <w:rPr>
-          <w:rFonts w:ascii="Times New Roman" w:hAnsi="Times New Roman" w:cs="Times New Roman"/>
-          <w:sz w:val="32"/>
-          <w:szCs w:val="32"/>
-          <w:lang w:val="ru-RU"/>
-        </w:rPr>
-        <w:t xml:space="preserve">не </w:t>
-      </w:r>
-      <w:r>
-        <w:rPr>
-          <w:rFonts w:ascii="Times New Roman" w:hAnsi="Times New Roman" w:cs="Times New Roman"/>
-          <w:sz w:val="32"/>
-          <w:szCs w:val="32"/>
-          <w:lang w:val="ru-RU"/>
-        </w:rPr>
-        <w:t>соответствует реальным значениям.</w:t>
-      </w:r>
-      <w:r>
-        <w:rPr>
-          <w:rFonts w:ascii="Times New Roman" w:hAnsi="Times New Roman" w:cs="Times New Roman"/>
-          <w:sz w:val="32"/>
-          <w:szCs w:val="32"/>
-          <w:lang w:val="ru-RU"/>
-        </w:rPr>
-        <w:t xml:space="preserve"> </w:t>
-      </w:r>
-      <w:r>
-        <w:rPr>
-          <w:rFonts w:ascii="Times New Roman" w:hAnsi="Times New Roman" w:cs="Times New Roman"/>
-          <w:sz w:val="32"/>
-          <w:szCs w:val="32"/>
-          <w:lang w:val="ru-RU"/>
-        </w:rPr>
-        <w:t xml:space="preserve">Скорее всего это связано с тем, </w:t>
-      </w:r>
-      <w:r>
-        <w:rPr>
-          <w:rFonts w:ascii="Times New Roman" w:hAnsi="Times New Roman" w:cs="Times New Roman"/>
-          <w:sz w:val="32"/>
-          <w:szCs w:val="32"/>
-          <w:lang w:val="ru-RU"/>
-        </w:rPr>
-        <w:t xml:space="preserve">что функция </w:t>
-      </w:r>
-      <w:proofErr w:type="spellStart"/>
-      <w:r>
-        <w:rPr>
-          <w:rFonts w:ascii="Times New Roman" w:hAnsi="Times New Roman" w:cs="Times New Roman"/>
-          <w:sz w:val="32"/>
-          <w:szCs w:val="32"/>
-          <w:lang w:val="ru-RU"/>
-        </w:rPr>
-        <w:t>хэширования</w:t>
-      </w:r>
-      <w:proofErr w:type="spellEnd"/>
-      <w:r>
-        <w:rPr>
-          <w:rFonts w:ascii="Times New Roman" w:hAnsi="Times New Roman" w:cs="Times New Roman"/>
-          <w:sz w:val="32"/>
-          <w:szCs w:val="32"/>
-          <w:lang w:val="ru-RU"/>
-        </w:rPr>
-        <w:t xml:space="preserve"> адресов в процессоре устроена так, что при любом достаточно большом шаге (≥4 КБ) фрагменты </w:t>
-      </w:r>
-      <w:proofErr w:type="spellStart"/>
-      <w:r>
-        <w:rPr>
-          <w:rFonts w:ascii="Times New Roman" w:hAnsi="Times New Roman" w:cs="Times New Roman"/>
-          <w:sz w:val="32"/>
-          <w:szCs w:val="32"/>
-          <w:lang w:val="ru-RU"/>
-        </w:rPr>
-        <w:t>мапятся</w:t>
-      </w:r>
-      <w:proofErr w:type="spellEnd"/>
-      <w:r>
-        <w:rPr>
-          <w:rFonts w:ascii="Times New Roman" w:hAnsi="Times New Roman" w:cs="Times New Roman"/>
-          <w:sz w:val="32"/>
-          <w:szCs w:val="32"/>
-          <w:lang w:val="ru-RU"/>
-        </w:rPr>
-        <w:t xml:space="preserve"> на ограниченное количество наборов каждого уровня кэша, и </w:t>
-      </w:r>
-      <w:r>
-        <w:rPr>
-          <w:rFonts w:ascii="Times New Roman" w:hAnsi="Times New Roman" w:cs="Times New Roman"/>
-          <w:sz w:val="32"/>
-          <w:szCs w:val="32"/>
-          <w:lang w:val="ru-RU"/>
-        </w:rPr>
-        <w:t>м</w:t>
-      </w:r>
-      <w:r>
-        <w:rPr>
-          <w:rFonts w:ascii="Times New Roman" w:hAnsi="Times New Roman" w:cs="Times New Roman"/>
-          <w:sz w:val="32"/>
-          <w:szCs w:val="32"/>
-          <w:lang w:val="ru-RU"/>
-        </w:rPr>
-        <w:t>ы измеряе</w:t>
-      </w:r>
-      <w:r>
-        <w:rPr>
-          <w:rFonts w:ascii="Times New Roman" w:hAnsi="Times New Roman" w:cs="Times New Roman"/>
-          <w:sz w:val="32"/>
-          <w:szCs w:val="32"/>
-          <w:lang w:val="ru-RU"/>
-        </w:rPr>
-        <w:t>м</w:t>
-      </w:r>
-      <w:r>
-        <w:rPr>
-          <w:rFonts w:ascii="Times New Roman" w:hAnsi="Times New Roman" w:cs="Times New Roman"/>
-          <w:sz w:val="32"/>
-          <w:szCs w:val="32"/>
-          <w:lang w:val="ru-RU"/>
-        </w:rPr>
-        <w:t xml:space="preserve"> </w:t>
-      </w:r>
-      <w:r>
-        <w:rPr>
-          <w:rFonts w:ascii="Times New Roman" w:hAnsi="Times New Roman" w:cs="Times New Roman"/>
-          <w:sz w:val="32"/>
-          <w:szCs w:val="32"/>
-          <w:lang w:val="ru-RU"/>
-        </w:rPr>
-        <w:lastRenderedPageBreak/>
-        <w:t>не реальную ассоциативность, а эффективную ёмкость при данном паттерне доступа</w:t>
-      </w:r>
-    </w:p>
-    <w:p>
-      <w:pPr>
-        <w:spacing w:line="360" w:lineRule="auto"/>
-        <w:rPr>
-          <w:rFonts w:ascii="Times New Roman" w:hAnsi="Times New Roman" w:cs="Times New Roman"/>
-          <w:sz w:val="32"/>
-          <w:szCs w:val="32"/>
-          <w:lang w:val="ru-RU"/>
-        </w:rPr>
-      </w:pPr>
-    </w:p>
-    <w:p>
-      <w:pPr>
-        <w:spacing w:line="360" w:lineRule="auto"/>
-        <w:rPr>
-          <w:rFonts w:ascii="Times New Roman" w:hAnsi="Times New Roman" w:cs="Times New Roman"/>
-          <w:sz w:val="32"/>
-          <w:szCs w:val="32"/>
-          <w:lang w:val="ru-RU"/>
-        </w:rPr>
-      </w:pPr>
-    </w:p>
-    <w:p>
-      <w:pPr>
-        <w:spacing w:line="360" w:lineRule="auto"/>
-        <w:rPr>
-          <w:rFonts w:ascii="Times New Roman" w:hAnsi="Times New Roman" w:cs="Times New Roman"/>
-          <w:sz w:val="32"/>
-          <w:szCs w:val="32"/>
-          <w:lang w:val="ru-RU"/>
-        </w:rPr>
-      </w:pPr>
-    </w:p>
-    <w:p>
-      <w:pPr>
-        <w:spacing w:line="360" w:lineRule="auto"/>
-        <w:rPr>
-          <w:rFonts w:ascii="Times New Roman" w:hAnsi="Times New Roman" w:cs="Times New Roman"/>
-          <w:sz w:val="32"/>
-          <w:szCs w:val="32"/>
-          <w:lang w:val="ru-RU"/>
-        </w:rPr>
-      </w:pPr>
     </w:p>
     <w:p>
       <w:pPr>
@@ -1450,7 +1556,6 @@
         <w:pStyle w:val="a5"/>
         <w:shd w:val="clear" w:color="auto" w:fill="FFFFFF"/>
         <w:spacing w:before="192"/>
-        <w:jc w:val="center"/>
         <w:rPr>
           <w:rFonts w:ascii="Times New Roman" w:eastAsia="Segoe UI" w:hAnsi="Times New Roman" w:cs="Times New Roman"/>
           <w:b/>
@@ -1468,205 +1573,6 @@
         <w:pStyle w:val="a5"/>
         <w:shd w:val="clear" w:color="auto" w:fill="FFFFFF"/>
         <w:spacing w:before="192"/>
-        <w:jc w:val="center"/>
-        <w:rPr>
-          <w:rFonts w:ascii="Times New Roman" w:eastAsia="Segoe UI" w:hAnsi="Times New Roman" w:cs="Times New Roman"/>
-          <w:b/>
-          <w:bCs/>
-          <w:color w:val="0F1115"/>
-          <w:sz w:val="32"/>
-          <w:szCs w:val="32"/>
-          <w:shd w:val="clear" w:color="auto" w:fill="FFFFFF"/>
-          <w:lang w:val="ru-RU"/>
-        </w:rPr>
-      </w:pPr>
-    </w:p>
-    <w:p>
-      <w:pPr>
-        <w:pStyle w:val="a5"/>
-        <w:shd w:val="clear" w:color="auto" w:fill="FFFFFF"/>
-        <w:spacing w:before="192"/>
-        <w:jc w:val="center"/>
-        <w:rPr>
-          <w:rFonts w:ascii="Times New Roman" w:eastAsia="Segoe UI" w:hAnsi="Times New Roman" w:cs="Times New Roman"/>
-          <w:b/>
-          <w:bCs/>
-          <w:color w:val="0F1115"/>
-          <w:sz w:val="32"/>
-          <w:szCs w:val="32"/>
-          <w:shd w:val="clear" w:color="auto" w:fill="FFFFFF"/>
-          <w:lang w:val="ru-RU"/>
-        </w:rPr>
-      </w:pPr>
-    </w:p>
-    <w:p>
-      <w:pPr>
-        <w:pStyle w:val="a5"/>
-        <w:shd w:val="clear" w:color="auto" w:fill="FFFFFF"/>
-        <w:spacing w:before="192"/>
-        <w:jc w:val="center"/>
-        <w:rPr>
-          <w:rFonts w:ascii="Times New Roman" w:eastAsia="Segoe UI" w:hAnsi="Times New Roman" w:cs="Times New Roman"/>
-          <w:b/>
-          <w:bCs/>
-          <w:color w:val="0F1115"/>
-          <w:sz w:val="32"/>
-          <w:szCs w:val="32"/>
-          <w:shd w:val="clear" w:color="auto" w:fill="FFFFFF"/>
-          <w:lang w:val="ru-RU"/>
-        </w:rPr>
-      </w:pPr>
-    </w:p>
-    <w:p>
-      <w:pPr>
-        <w:pStyle w:val="a5"/>
-        <w:shd w:val="clear" w:color="auto" w:fill="FFFFFF"/>
-        <w:spacing w:before="192"/>
-        <w:jc w:val="center"/>
-        <w:rPr>
-          <w:rFonts w:ascii="Times New Roman" w:eastAsia="Segoe UI" w:hAnsi="Times New Roman" w:cs="Times New Roman"/>
-          <w:b/>
-          <w:bCs/>
-          <w:color w:val="0F1115"/>
-          <w:sz w:val="32"/>
-          <w:szCs w:val="32"/>
-          <w:shd w:val="clear" w:color="auto" w:fill="FFFFFF"/>
-          <w:lang w:val="ru-RU"/>
-        </w:rPr>
-      </w:pPr>
-    </w:p>
-    <w:p>
-      <w:pPr>
-        <w:pStyle w:val="a5"/>
-        <w:shd w:val="clear" w:color="auto" w:fill="FFFFFF"/>
-        <w:spacing w:before="192"/>
-        <w:jc w:val="center"/>
-        <w:rPr>
-          <w:rFonts w:ascii="Times New Roman" w:eastAsia="Segoe UI" w:hAnsi="Times New Roman" w:cs="Times New Roman"/>
-          <w:b/>
-          <w:bCs/>
-          <w:color w:val="0F1115"/>
-          <w:sz w:val="32"/>
-          <w:szCs w:val="32"/>
-          <w:shd w:val="clear" w:color="auto" w:fill="FFFFFF"/>
-          <w:lang w:val="ru-RU"/>
-        </w:rPr>
-      </w:pPr>
-    </w:p>
-    <w:p>
-      <w:pPr>
-        <w:pStyle w:val="a5"/>
-        <w:shd w:val="clear" w:color="auto" w:fill="FFFFFF"/>
-        <w:spacing w:before="192"/>
-        <w:jc w:val="center"/>
-        <w:rPr>
-          <w:rFonts w:ascii="Times New Roman" w:eastAsia="Segoe UI" w:hAnsi="Times New Roman" w:cs="Times New Roman"/>
-          <w:b/>
-          <w:bCs/>
-          <w:color w:val="0F1115"/>
-          <w:sz w:val="32"/>
-          <w:szCs w:val="32"/>
-          <w:shd w:val="clear" w:color="auto" w:fill="FFFFFF"/>
-          <w:lang w:val="ru-RU"/>
-        </w:rPr>
-      </w:pPr>
-    </w:p>
-    <w:p>
-      <w:pPr>
-        <w:pStyle w:val="a5"/>
-        <w:shd w:val="clear" w:color="auto" w:fill="FFFFFF"/>
-        <w:spacing w:before="192"/>
-        <w:jc w:val="center"/>
-        <w:rPr>
-          <w:rFonts w:ascii="Times New Roman" w:eastAsia="Segoe UI" w:hAnsi="Times New Roman" w:cs="Times New Roman"/>
-          <w:b/>
-          <w:bCs/>
-          <w:color w:val="0F1115"/>
-          <w:sz w:val="32"/>
-          <w:szCs w:val="32"/>
-          <w:shd w:val="clear" w:color="auto" w:fill="FFFFFF"/>
-          <w:lang w:val="ru-RU"/>
-        </w:rPr>
-      </w:pPr>
-    </w:p>
-    <w:p>
-      <w:pPr>
-        <w:pStyle w:val="a5"/>
-        <w:shd w:val="clear" w:color="auto" w:fill="FFFFFF"/>
-        <w:spacing w:before="192"/>
-        <w:jc w:val="center"/>
-        <w:rPr>
-          <w:rFonts w:ascii="Times New Roman" w:eastAsia="Segoe UI" w:hAnsi="Times New Roman" w:cs="Times New Roman"/>
-          <w:b/>
-          <w:bCs/>
-          <w:color w:val="0F1115"/>
-          <w:sz w:val="32"/>
-          <w:szCs w:val="32"/>
-          <w:shd w:val="clear" w:color="auto" w:fill="FFFFFF"/>
-          <w:lang w:val="ru-RU"/>
-        </w:rPr>
-      </w:pPr>
-    </w:p>
-    <w:p>
-      <w:pPr>
-        <w:pStyle w:val="a5"/>
-        <w:shd w:val="clear" w:color="auto" w:fill="FFFFFF"/>
-        <w:spacing w:before="192"/>
-        <w:jc w:val="center"/>
-        <w:rPr>
-          <w:rFonts w:ascii="Times New Roman" w:eastAsia="Segoe UI" w:hAnsi="Times New Roman" w:cs="Times New Roman"/>
-          <w:b/>
-          <w:bCs/>
-          <w:color w:val="0F1115"/>
-          <w:sz w:val="32"/>
-          <w:szCs w:val="32"/>
-          <w:shd w:val="clear" w:color="auto" w:fill="FFFFFF"/>
-          <w:lang w:val="ru-RU"/>
-        </w:rPr>
-      </w:pPr>
-    </w:p>
-    <w:p>
-      <w:pPr>
-        <w:pStyle w:val="a5"/>
-        <w:shd w:val="clear" w:color="auto" w:fill="FFFFFF"/>
-        <w:spacing w:before="192"/>
-        <w:jc w:val="center"/>
-        <w:rPr>
-          <w:rFonts w:ascii="Times New Roman" w:eastAsia="Segoe UI" w:hAnsi="Times New Roman" w:cs="Times New Roman"/>
-          <w:b/>
-          <w:bCs/>
-          <w:color w:val="0F1115"/>
-          <w:sz w:val="32"/>
-          <w:szCs w:val="32"/>
-          <w:shd w:val="clear" w:color="auto" w:fill="FFFFFF"/>
-          <w:lang w:val="ru-RU"/>
-        </w:rPr>
-      </w:pPr>
-    </w:p>
-    <w:p>
-      <w:pPr>
-        <w:pStyle w:val="a5"/>
-        <w:shd w:val="clear" w:color="auto" w:fill="FFFFFF"/>
-        <w:spacing w:before="192"/>
-        <w:jc w:val="center"/>
-        <w:rPr>
-          <w:rFonts w:ascii="Times New Roman" w:eastAsia="Segoe UI" w:hAnsi="Times New Roman" w:cs="Times New Roman"/>
-          <w:b/>
-          <w:bCs/>
-          <w:color w:val="0F1115"/>
-          <w:sz w:val="32"/>
-          <w:szCs w:val="32"/>
-          <w:shd w:val="clear" w:color="auto" w:fill="FFFFFF"/>
-          <w:lang w:val="ru-RU"/>
-        </w:rPr>
-      </w:pPr>
-    </w:p>
-    <w:p>
-      <w:pPr>
-        <w:pStyle w:val="a5"/>
-        <w:shd w:val="clear" w:color="auto" w:fill="FFFFFF"/>
-        <w:spacing w:before="192"/>
-        <w:jc w:val="center"/>
         <w:rPr>
           <w:rFonts w:ascii="Times New Roman" w:eastAsia="Segoe UI" w:hAnsi="Times New Roman" w:cs="Times New Roman"/>
           <w:b/>
@@ -1777,7 +1683,7 @@
         </w:rPr>
         <w:t xml:space="preserve">: </w:t>
       </w:r>
-      <w:hyperlink r:id="rId8" w:history="1">
+      <w:hyperlink r:id="rId11" w:history="1">
         <w:r>
           <w:rPr>
             <w:rStyle w:val="a3"/>
@@ -1786,17 +1692,7 @@
             <w:szCs w:val="32"/>
             <w:lang w:val="ru-RU" w:eastAsia="zh-CN"/>
           </w:rPr>
-          <w:t>https://github.com/DrySparrow/ECnSC/tree/lab</w:t>
-        </w:r>
-        <w:r>
-          <w:rPr>
-            <w:rStyle w:val="a3"/>
-            <w:rFonts w:ascii="Times New Roman" w:eastAsia="SimSun" w:hAnsi="Times New Roman" w:cs="Times New Roman"/>
-            <w:sz w:val="32"/>
-            <w:szCs w:val="32"/>
-            <w:lang w:val="ru-RU" w:eastAsia="zh-CN"/>
-          </w:rPr>
-          <w:t>9</w:t>
+          <w:t>https://github.com/DrySparrow/ECnSC/tree/lab9</w:t>
         </w:r>
       </w:hyperlink>
     </w:p>
@@ -1828,16 +1724,7 @@
           <w:szCs w:val="32"/>
           <w:lang w:val="ru-RU" w:eastAsia="zh-CN"/>
         </w:rPr>
-        <w:t>Команд</w:t>
-      </w:r>
-      <w:r>
-        <w:rPr>
-          <w:rFonts w:ascii="Times New Roman" w:eastAsia="SimSun" w:hAnsi="Times New Roman" w:cs="Times New Roman"/>
-          <w:sz w:val="32"/>
-          <w:szCs w:val="32"/>
-          <w:lang w:val="ru-RU" w:eastAsia="zh-CN"/>
-        </w:rPr>
-        <w:t>а</w:t>
+        <w:t>Команда</w:t>
       </w:r>
       <w:r>
         <w:rPr>
@@ -1893,16 +1780,7 @@
           <w:szCs w:val="32"/>
           <w:lang w:val="ru-RU" w:eastAsia="zh-CN"/>
         </w:rPr>
-        <w:t xml:space="preserve">++ </w:t>
-      </w:r>
-      <w:r>
-        <w:rPr>
-          <w:rFonts w:ascii="Times New Roman" w:eastAsia="SimSun" w:hAnsi="Times New Roman"/>
-          <w:sz w:val="32"/>
-          <w:szCs w:val="32"/>
-          <w:lang w:val="ru-RU" w:eastAsia="zh-CN"/>
-        </w:rPr>
-        <w:t>-</w:t>
+        <w:t>++ -</w:t>
       </w:r>
       <w:r>
         <w:rPr>
@@ -2197,6 +2075,7 @@
                 <w:color w:val="000000"/>
                 <w:sz w:val="28"/>
                 <w:szCs w:val="28"/>
+                <w:lang w:val="en-US"/>
               </w:rPr>
               <w:tab/>
             </w:r>
@@ -12303,4 +12182,16 @@
   <a:objectDefaults/>
   <a:extraClrSchemeLst/>
 </a:theme>
+</file>
+
+<file path=customXml/item1.xml><?xml version="1.0" encoding="utf-8"?>
+<b:Sources xmlns:b="http://schemas.openxmlformats.org/officeDocument/2006/bibliography" xmlns="http://schemas.openxmlformats.org/officeDocument/2006/bibliography" SelectedStyle="\APASixthEditionOfficeOnline.xsl" StyleName="APA" Version="6"/>
+</file>
+
+<file path=customXml/itemProps1.xml><?xml version="1.0" encoding="utf-8"?>
+<ds:datastoreItem xmlns:ds="http://schemas.openxmlformats.org/officeDocument/2006/customXml" ds:itemID="{CB7FCB96-F90B-4A04-AD45-152AF4BB5293}">
+  <ds:schemaRefs>
+    <ds:schemaRef ds:uri="http://schemas.openxmlformats.org/officeDocument/2006/bibliography"/>
+  </ds:schemaRefs>
+</ds:datastoreItem>
 </file>
</xml_diff>